<commit_message>
Name and credentials: Jesse Jonesberg, MSW, LCSW, CPS, www.intrinsicchange.com
On the handbook's cover (PDF and Word), the plan on one page, the
implementation chapter's "Who does what", and the signature of all four
emails. The plan still prints on one page.

Co-Authored-By: Claude Opus 5.5 <noreply@anthropic.com>
Claude-Session: https://claude.ai/code/session_01NQwyA57oAsCk3BA8fwH8DZ
</commit_message>
<xml_diff>
--- a/docs/guides/NAMI_Dashboard_Suite_Handbook.docx
+++ b/docs/guides/NAMI_Dashboard_Suite_Handbook.docx
@@ -58,7 +58,15 @@
         <w:rPr>
           <w:color w:val="56645F"/>
         </w:rPr>
-        <w:t>Prepared by Jesse Berg</w:t>
+        <w:t>Prepared by Jesse Jonesberg, MSW, LCSW, CPS</w:t>
+      </w:r>
+    </w:p>
+    <w:p>
+      <w:r>
+        <w:rPr>
+          <w:color w:val="56645F"/>
+        </w:rPr>
+        <w:t>www.intrinsicchange.com</w:t>
       </w:r>
     </w:p>
     <w:p>
@@ -450,7 +458,7 @@
       <w:r>
         <w:drawing>
           <wp:inline xmlns:a="http://schemas.openxmlformats.org/drawingml/2006/main" xmlns:pic="http://schemas.openxmlformats.org/drawingml/2006/picture">
-            <wp:extent cx="6309360" cy="8403717"/>
+            <wp:extent cx="6309360" cy="8289798"/>
             <wp:docPr id="1" name="Picture 1"/>
             <wp:cNvGraphicFramePr>
               <a:graphicFrameLocks noChangeAspect="1"/>
@@ -471,7 +479,7 @@
                   <pic:spPr>
                     <a:xfrm>
                       <a:off x="0" y="0"/>
-                      <a:ext cx="6309360" cy="8403717"/>
+                      <a:ext cx="6309360" cy="8289798"/>
                     </a:xfrm>
                     <a:prstGeom prst="rect"/>
                   </pic:spPr>
@@ -837,7 +845,7 @@
               <w:rPr>
                 <w:sz w:val="18"/>
               </w:rPr>
-              <w:t>Jesse Berg</w:t>
+              <w:t>Jesse Jonesberg, MSW, LCSW, CPS</w:t>
             </w:r>
           </w:p>
         </w:tc>
@@ -7903,7 +7911,17 @@
     </w:p>
     <w:p>
       <w:r>
-        <w:t>Jesse</w:t>
+        <w:t>Jesse Jonesberg, MSW, LCSW, CPS</w:t>
+      </w:r>
+    </w:p>
+    <w:p>
+      <w:r>
+        <w:t>www.intrinsicchange.com</w:t>
+      </w:r>
+    </w:p>
+    <w:p>
+      <w:r>
+        <w:t>[phone]</w:t>
       </w:r>
     </w:p>
     <w:p>
@@ -8173,7 +8191,12 @@
     </w:p>
     <w:p>
       <w:r>
-        <w:t>Jesse</w:t>
+        <w:t>Jesse Jonesberg, MSW, LCSW, CPS</w:t>
+      </w:r>
+    </w:p>
+    <w:p>
+      <w:r>
+        <w:t>www.intrinsicchange.com</w:t>
       </w:r>
     </w:p>
     <w:p>
@@ -8412,7 +8435,12 @@
     </w:p>
     <w:p>
       <w:r>
-        <w:t>Jesse</w:t>
+        <w:t>Jesse Jonesberg, MSW, LCSW, CPS</w:t>
+      </w:r>
+    </w:p>
+    <w:p>
+      <w:r>
+        <w:t>www.intrinsicchange.com</w:t>
       </w:r>
     </w:p>
     <w:p>
@@ -8668,7 +8696,12 @@
     </w:p>
     <w:p>
       <w:r>
-        <w:t>Jesse</w:t>
+        <w:t>Jesse Jonesberg, MSW, LCSW, CPS</w:t>
+      </w:r>
+    </w:p>
+    <w:p>
+      <w:r>
+        <w:t>www.intrinsicchange.com</w:t>
       </w:r>
     </w:p>
     <w:p>

</xml_diff>